<commit_message>
Comunicado: precisiones jurídicas de la valoración externa y constancias individuales
Co-Authored-By: Claude Opus 5.5 <noreply@anthropic.com>
Claude-Session: https://claude.ai/code/session_01V7BfzBTA8TEWMK1apGBBKC
</commit_message>
<xml_diff>
--- a/casos/laboral-kcarmona/escritos/2026-10-26_Comunicado_Lineamientos_Equipo_Administrativo.docx
+++ b/casos/laboral-kcarmona/escritos/2026-10-26_Comunicado_Lineamientos_Equipo_Administrativo.docx
@@ -342,7 +342,7 @@
           <w:color w:val="2F2E47"/>
           <w:sz w:val="21"/>
         </w:rPr>
-        <w:t>Ante una persona en crisis o con señales de riesgo, se comunica de inmediato al equipo clínico y se acompaña a la persona mientras tanto.</w:t>
+        <w:t>Ante una persona en crisis o con señales de riesgo, se comunica de inmediato al equipo clínico y se acompaña a la persona mientras tanto. Si hay peligro inmediato, se activan los servicios de emergencia.</w:t>
       </w:r>
     </w:p>
     <w:p>
@@ -463,7 +463,7 @@
           <w:color w:val="2F2E47"/>
           <w:sz w:val="21"/>
         </w:rPr>
-        <w:t>Frente a visitantes y proveedores, la comunicación sobre la clínica y su equipo es neutral y respetuosa.</w:t>
+        <w:t>La información que se da a visitantes y proveedores sobre la clínica es veraz, profesional y respeta la confidencialidad.</w:t>
       </w:r>
     </w:p>
     <w:p>
@@ -478,7 +478,7 @@
           <w:color w:val="2F2E47"/>
           <w:sz w:val="21"/>
         </w:rPr>
-        <w:t>Nada de lo anterior limita el derecho de cada persona a plantear sus reclamos ante las instancias que la ley establece.</w:t>
+        <w:t>Nada de lo anterior limita el derecho de cada persona a plantear sus reclamos ante las instancias que la ley establece. Nadie será objeto de represalias por ejercer de buena fe sus derechos.</w:t>
       </w:r>
     </w:p>
     <w:p>
@@ -524,7 +524,22 @@
           <w:color w:val="2F2E47"/>
           <w:sz w:val="21"/>
         </w:rPr>
-        <w:t>La información salarial de cada persona es confidencial y se conversa en privado.</w:t>
+        <w:t>La información salarial que administra Poïesis se trata con reserva. Esto no impide que cada persona hable de sus propias condiciones laborales.</w:t>
+      </w:r>
+    </w:p>
+    <w:p>
+      <w:pPr>
+        <w:pStyle w:val="ListBullet"/>
+        <w:spacing w:before="0" w:after="60" w:line="300" w:lineRule="auto"/>
+      </w:pPr>
+      <w:r>
+        <w:rPr>
+          <w:rFonts w:ascii="Georgia" w:hAnsi="Georgia"/>
+          <w:b w:val="0"/>
+          <w:color w:val="2F2E47"/>
+          <w:sz w:val="21"/>
+        </w:rPr>
+        <w:t>Cualquier pérdida o divulgación accidental de información se comunica de inmediato a la jefatura.</w:t>
       </w:r>
     </w:p>
     <w:p>
@@ -681,7 +696,21 @@
           <w:color w:val="2F2E47"/>
           <w:sz w:val="21"/>
         </w:rPr>
-        <w:t>En Poïesis, conforme al Código de Trabajo, los incumplimientos se atienden de forma gradual y proporcional. Cada situación se conversa primero con la persona, y su versión se escucha. Si corresponde, se aplica una amonestación escrita. Cuando una falta es grave, o se repite después de haber sido advertida por escrito, la ley permite la terminación del contrato sin responsabilidad patronal.</w:t>
+        <w:t>En Poïesis, conforme al Código de Trabajo, los incumplimientos se atienden de forma objetiva, documentada y proporcional. Antes de cualquier medida se esclarecen los hechos y se escucha a la persona. Según el caso, puede tratarse de una conversación, una amonestación escrita u otra medida legalmente procedente. Una falta grave, o la reiteración de faltas ya advertidas, puede justificar la terminación del contrato sin responsabilidad patronal, siempre que se cumplan los requisitos legales.</w:t>
+      </w:r>
+    </w:p>
+    <w:p>
+      <w:pPr>
+        <w:spacing w:before="0" w:after="120" w:line="300" w:lineRule="auto"/>
+      </w:pPr>
+      <w:r>
+        <w:rPr>
+          <w:rFonts w:ascii="Georgia" w:hAnsi="Georgia"/>
+          <w:b w:val="0"/>
+          <w:color w:val="2F2E47"/>
+          <w:sz w:val="21"/>
+        </w:rPr>
+        <w:t>Ninguna sanción es automática. Ejercer derechos laborales, presentar un reclamo o no aceptar una modificación contractual no constituyen faltas.</w:t>
       </w:r>
     </w:p>
     <w:p>
@@ -696,6 +725,20 @@
           <w:sz w:val="21"/>
         </w:rPr>
         <w:t>Lo compartimos por transparencia, para que todas las personas conozcan el marco con la misma claridad. Nuestro interés es que no sea necesario aplicarlo, y confiamos en que así será.</w:t>
+      </w:r>
+    </w:p>
+    <w:p>
+      <w:pPr>
+        <w:spacing w:before="0" w:after="120" w:line="300" w:lineRule="auto"/>
+      </w:pPr>
+      <w:r>
+        <w:rPr>
+          <w:rFonts w:ascii="Georgia" w:hAnsi="Georgia"/>
+          <w:b w:val="0"/>
+          <w:color w:val="2F2E47"/>
+          <w:sz w:val="21"/>
+        </w:rPr>
+        <w:t>Este comunicado no modifica salarios, jornadas, funciones ni otras condiciones del contrato de trabajo.</w:t>
       </w:r>
     </w:p>
     <w:p>
@@ -827,7 +870,7 @@
           <w:color w:val="131237"/>
           <w:sz w:val="28"/>
         </w:rPr>
-        <w:t>Acuse de recibo</w:t>
+        <w:t>Constancia de recepción</w:t>
       </w:r>
     </w:p>
     <w:p>
@@ -841,7 +884,7 @@
           <w:color w:val="2F2E47"/>
           <w:sz w:val="21"/>
         </w:rPr>
-        <w:t>Mi firma indica que recibí y leí este comunicado.</w:t>
+        <w:t>Mediante mi firma, dejo constancia de haber recibido el comunicado «Lineamientos del Equipo Administrativo», con fecha 27 de octubre de 2026. Esta constancia acredita únicamente la recepción. No implica aceptación de modificaciones contractuales ni renuncia a derechos.</w:t>
       </w:r>
     </w:p>
     <w:tbl>
@@ -850,25 +893,22 @@
         <w:jc w:val="center"/>
         <w:tblLook w:firstColumn="1" w:firstRow="1" w:lastColumn="0" w:lastRow="0" w:noHBand="0" w:noVBand="1" w:val="04A0"/>
         <w:tblBorders>
-          <w:top w:val="single" w:sz="4" w:color="D1D0CB"/>
-          <w:left w:val="single" w:sz="4" w:color="D1D0CB"/>
-          <w:bottom w:val="single" w:sz="4" w:color="D1D0CB"/>
-          <w:right w:val="single" w:sz="4" w:color="D1D0CB"/>
-          <w:insideH w:val="single" w:sz="4" w:color="D1D0CB"/>
-          <w:insideV w:val="single" w:sz="4" w:color="D1D0CB"/>
+          <w:top w:val="nil"/>
+          <w:left w:val="nil"/>
+          <w:bottom w:val="nil"/>
+          <w:right w:val="nil"/>
+          <w:insideH w:val="nil"/>
+          <w:insideV w:val="nil"/>
         </w:tblBorders>
       </w:tblPr>
       <w:tblGrid>
-        <w:gridCol w:w="2268"/>
-        <w:gridCol w:w="2268"/>
-        <w:gridCol w:w="2268"/>
-        <w:gridCol w:w="2268"/>
+        <w:gridCol w:w="4536"/>
+        <w:gridCol w:w="4536"/>
       </w:tblGrid>
       <w:tr>
         <w:tc>
           <w:tcPr>
-            <w:tcW w:type="dxa" w:w="2268"/>
-            <w:shd w:val="clear" w:color="auto" w:fill="D1D0CB"/>
+            <w:tcW w:type="dxa" w:w="4536"/>
           </w:tcPr>
           <w:p>
             <w:pPr>
@@ -877,79 +917,17 @@
             <w:r>
               <w:rPr>
                 <w:rFonts w:ascii="Georgia" w:hAnsi="Georgia"/>
-                <w:b/>
-                <w:color w:val="131237"/>
+                <w:b w:val="0"/>
+                <w:color w:val="5C6684"/>
                 <w:sz w:val="19"/>
               </w:rPr>
-              <w:t>Nombre</w:t>
+              <w:t>Nombre completo</w:t>
             </w:r>
           </w:p>
         </w:tc>
         <w:tc>
           <w:tcPr>
-            <w:tcW w:type="dxa" w:w="2268"/>
-            <w:shd w:val="clear" w:color="auto" w:fill="D1D0CB"/>
-          </w:tcPr>
-          <w:p>
-            <w:pPr>
-              <w:spacing w:before="40" w:after="40" w:line="264" w:lineRule="auto"/>
-            </w:pPr>
-            <w:r>
-              <w:rPr>
-                <w:rFonts w:ascii="Georgia" w:hAnsi="Georgia"/>
-                <w:b/>
-                <w:color w:val="131237"/>
-                <w:sz w:val="19"/>
-              </w:rPr>
-              <w:t>Cédula</w:t>
-            </w:r>
-          </w:p>
-        </w:tc>
-        <w:tc>
-          <w:tcPr>
-            <w:tcW w:type="dxa" w:w="2268"/>
-            <w:shd w:val="clear" w:color="auto" w:fill="D1D0CB"/>
-          </w:tcPr>
-          <w:p>
-            <w:pPr>
-              <w:spacing w:before="40" w:after="40" w:line="264" w:lineRule="auto"/>
-            </w:pPr>
-            <w:r>
-              <w:rPr>
-                <w:rFonts w:ascii="Georgia" w:hAnsi="Georgia"/>
-                <w:b/>
-                <w:color w:val="131237"/>
-                <w:sz w:val="19"/>
-              </w:rPr>
-              <w:t>Firma</w:t>
-            </w:r>
-          </w:p>
-        </w:tc>
-        <w:tc>
-          <w:tcPr>
-            <w:tcW w:type="dxa" w:w="2268"/>
-            <w:shd w:val="clear" w:color="auto" w:fill="D1D0CB"/>
-          </w:tcPr>
-          <w:p>
-            <w:pPr>
-              <w:spacing w:before="40" w:after="40" w:line="264" w:lineRule="auto"/>
-            </w:pPr>
-            <w:r>
-              <w:rPr>
-                <w:rFonts w:ascii="Georgia" w:hAnsi="Georgia"/>
-                <w:b/>
-                <w:color w:val="131237"/>
-                <w:sz w:val="19"/>
-              </w:rPr>
-              <w:t>Fecha</w:t>
-            </w:r>
-          </w:p>
-        </w:tc>
-      </w:tr>
-      <w:tr>
-        <w:tc>
-          <w:tcPr>
-            <w:tcW w:type="dxa" w:w="2268"/>
+            <w:tcW w:type="dxa" w:w="4536"/>
           </w:tcPr>
           <w:p>
             <w:pPr>
@@ -966,29 +944,30 @@
             </w:r>
           </w:p>
         </w:tc>
+      </w:tr>
+      <w:tr>
         <w:tc>
           <w:tcPr>
-            <w:tcW w:type="dxa" w:w="2268"/>
+            <w:tcW w:type="dxa" w:w="4536"/>
           </w:tcPr>
           <w:p>
             <w:pPr>
               <w:spacing w:before="40" w:after="40" w:line="264" w:lineRule="auto"/>
             </w:pPr>
+            <w:r>
+              <w:rPr>
+                <w:rFonts w:ascii="Georgia" w:hAnsi="Georgia"/>
+                <w:b w:val="0"/>
+                <w:color w:val="5C6684"/>
+                <w:sz w:val="19"/>
+              </w:rPr>
+              <w:t>Cédula</w:t>
+            </w:r>
           </w:p>
         </w:tc>
         <w:tc>
           <w:tcPr>
-            <w:tcW w:type="dxa" w:w="2268"/>
-          </w:tcPr>
-          <w:p>
-            <w:pPr>
-              <w:spacing w:before="40" w:after="40" w:line="264" w:lineRule="auto"/>
-            </w:pPr>
-          </w:p>
-        </w:tc>
-        <w:tc>
-          <w:tcPr>
-            <w:tcW w:type="dxa" w:w="2268"/>
+            <w:tcW w:type="dxa" w:w="4536"/>
           </w:tcPr>
           <w:p>
             <w:pPr>
@@ -1000,7 +979,143 @@
       <w:tr>
         <w:tc>
           <w:tcPr>
-            <w:tcW w:type="dxa" w:w="2268"/>
+            <w:tcW w:type="dxa" w:w="4536"/>
+          </w:tcPr>
+          <w:p>
+            <w:pPr>
+              <w:spacing w:before="40" w:after="40" w:line="264" w:lineRule="auto"/>
+            </w:pPr>
+            <w:r>
+              <w:rPr>
+                <w:rFonts w:ascii="Georgia" w:hAnsi="Georgia"/>
+                <w:b w:val="0"/>
+                <w:color w:val="5C6684"/>
+                <w:sz w:val="19"/>
+              </w:rPr>
+              <w:t>Fecha de recepción</w:t>
+            </w:r>
+          </w:p>
+        </w:tc>
+        <w:tc>
+          <w:tcPr>
+            <w:tcW w:type="dxa" w:w="4536"/>
+          </w:tcPr>
+          <w:p>
+            <w:pPr>
+              <w:spacing w:before="40" w:after="40" w:line="264" w:lineRule="auto"/>
+            </w:pPr>
+          </w:p>
+        </w:tc>
+      </w:tr>
+      <w:tr>
+        <w:tc>
+          <w:tcPr>
+            <w:tcW w:type="dxa" w:w="4536"/>
+          </w:tcPr>
+          <w:p>
+            <w:pPr>
+              <w:spacing w:before="40" w:after="40" w:line="264" w:lineRule="auto"/>
+            </w:pPr>
+            <w:r>
+              <w:rPr>
+                <w:rFonts w:ascii="Georgia" w:hAnsi="Georgia"/>
+                <w:b w:val="0"/>
+                <w:color w:val="5C6684"/>
+                <w:sz w:val="19"/>
+              </w:rPr>
+              <w:t>Firma</w:t>
+            </w:r>
+          </w:p>
+        </w:tc>
+        <w:tc>
+          <w:tcPr>
+            <w:tcW w:type="dxa" w:w="4536"/>
+          </w:tcPr>
+          <w:p>
+            <w:pPr>
+              <w:spacing w:before="40" w:after="40" w:line="264" w:lineRule="auto"/>
+            </w:pPr>
+          </w:p>
+        </w:tc>
+      </w:tr>
+    </w:tbl>
+    <w:p/>
+    <w:p>
+      <w:r>
+        <w:br w:type="page"/>
+      </w:r>
+    </w:p>
+    <w:p>
+      <w:pPr>
+        <w:spacing w:before="280" w:after="120" w:line="300" w:lineRule="auto"/>
+        <w:pBdr>
+          <w:bottom w:val="single" w:sz="6" w:space="4" w:color="D1D0CB"/>
+        </w:pBdr>
+      </w:pPr>
+      <w:r>
+        <w:rPr>
+          <w:rFonts w:ascii="Safira March" w:hAnsi="Safira March"/>
+          <w:color w:val="131237"/>
+          <w:sz w:val="28"/>
+        </w:rPr>
+        <w:t>Constancia de recepción</w:t>
+      </w:r>
+    </w:p>
+    <w:p>
+      <w:pPr>
+        <w:spacing w:before="0" w:after="120" w:line="300" w:lineRule="auto"/>
+      </w:pPr>
+      <w:r>
+        <w:rPr>
+          <w:rFonts w:ascii="Georgia" w:hAnsi="Georgia"/>
+          <w:b w:val="0"/>
+          <w:color w:val="2F2E47"/>
+          <w:sz w:val="21"/>
+        </w:rPr>
+        <w:t>Mediante mi firma, dejo constancia de haber recibido el comunicado «Lineamientos del Equipo Administrativo», con fecha 27 de octubre de 2026. Esta constancia acredita únicamente la recepción. No implica aceptación de modificaciones contractuales ni renuncia a derechos.</w:t>
+      </w:r>
+    </w:p>
+    <w:tbl>
+      <w:tblPr>
+        <w:tblW w:type="auto" w:w="0"/>
+        <w:jc w:val="center"/>
+        <w:tblLook w:firstColumn="1" w:firstRow="1" w:lastColumn="0" w:lastRow="0" w:noHBand="0" w:noVBand="1" w:val="04A0"/>
+        <w:tblBorders>
+          <w:top w:val="nil"/>
+          <w:left w:val="nil"/>
+          <w:bottom w:val="nil"/>
+          <w:right w:val="nil"/>
+          <w:insideH w:val="nil"/>
+          <w:insideV w:val="nil"/>
+        </w:tblBorders>
+      </w:tblPr>
+      <w:tblGrid>
+        <w:gridCol w:w="4536"/>
+        <w:gridCol w:w="4536"/>
+      </w:tblGrid>
+      <w:tr>
+        <w:tc>
+          <w:tcPr>
+            <w:tcW w:type="dxa" w:w="4536"/>
+          </w:tcPr>
+          <w:p>
+            <w:pPr>
+              <w:spacing w:before="40" w:after="40" w:line="264" w:lineRule="auto"/>
+            </w:pPr>
+            <w:r>
+              <w:rPr>
+                <w:rFonts w:ascii="Georgia" w:hAnsi="Georgia"/>
+                <w:b w:val="0"/>
+                <w:color w:val="5C6684"/>
+                <w:sz w:val="19"/>
+              </w:rPr>
+              <w:t>Nombre completo</w:t>
+            </w:r>
+          </w:p>
+        </w:tc>
+        <w:tc>
+          <w:tcPr>
+            <w:tcW w:type="dxa" w:w="4536"/>
           </w:tcPr>
           <w:p>
             <w:pPr>
@@ -1017,29 +1132,30 @@
             </w:r>
           </w:p>
         </w:tc>
+      </w:tr>
+      <w:tr>
         <w:tc>
           <w:tcPr>
-            <w:tcW w:type="dxa" w:w="2268"/>
+            <w:tcW w:type="dxa" w:w="4536"/>
           </w:tcPr>
           <w:p>
             <w:pPr>
               <w:spacing w:before="40" w:after="40" w:line="264" w:lineRule="auto"/>
             </w:pPr>
+            <w:r>
+              <w:rPr>
+                <w:rFonts w:ascii="Georgia" w:hAnsi="Georgia"/>
+                <w:b w:val="0"/>
+                <w:color w:val="5C6684"/>
+                <w:sz w:val="19"/>
+              </w:rPr>
+              <w:t>Cédula</w:t>
+            </w:r>
           </w:p>
         </w:tc>
         <w:tc>
           <w:tcPr>
-            <w:tcW w:type="dxa" w:w="2268"/>
-          </w:tcPr>
-          <w:p>
-            <w:pPr>
-              <w:spacing w:before="40" w:after="40" w:line="264" w:lineRule="auto"/>
-            </w:pPr>
-          </w:p>
-        </w:tc>
-        <w:tc>
-          <w:tcPr>
-            <w:tcW w:type="dxa" w:w="2268"/>
+            <w:tcW w:type="dxa" w:w="4536"/>
           </w:tcPr>
           <w:p>
             <w:pPr>
@@ -1051,7 +1167,143 @@
       <w:tr>
         <w:tc>
           <w:tcPr>
-            <w:tcW w:type="dxa" w:w="2268"/>
+            <w:tcW w:type="dxa" w:w="4536"/>
+          </w:tcPr>
+          <w:p>
+            <w:pPr>
+              <w:spacing w:before="40" w:after="40" w:line="264" w:lineRule="auto"/>
+            </w:pPr>
+            <w:r>
+              <w:rPr>
+                <w:rFonts w:ascii="Georgia" w:hAnsi="Georgia"/>
+                <w:b w:val="0"/>
+                <w:color w:val="5C6684"/>
+                <w:sz w:val="19"/>
+              </w:rPr>
+              <w:t>Fecha de recepción</w:t>
+            </w:r>
+          </w:p>
+        </w:tc>
+        <w:tc>
+          <w:tcPr>
+            <w:tcW w:type="dxa" w:w="4536"/>
+          </w:tcPr>
+          <w:p>
+            <w:pPr>
+              <w:spacing w:before="40" w:after="40" w:line="264" w:lineRule="auto"/>
+            </w:pPr>
+          </w:p>
+        </w:tc>
+      </w:tr>
+      <w:tr>
+        <w:tc>
+          <w:tcPr>
+            <w:tcW w:type="dxa" w:w="4536"/>
+          </w:tcPr>
+          <w:p>
+            <w:pPr>
+              <w:spacing w:before="40" w:after="40" w:line="264" w:lineRule="auto"/>
+            </w:pPr>
+            <w:r>
+              <w:rPr>
+                <w:rFonts w:ascii="Georgia" w:hAnsi="Georgia"/>
+                <w:b w:val="0"/>
+                <w:color w:val="5C6684"/>
+                <w:sz w:val="19"/>
+              </w:rPr>
+              <w:t>Firma</w:t>
+            </w:r>
+          </w:p>
+        </w:tc>
+        <w:tc>
+          <w:tcPr>
+            <w:tcW w:type="dxa" w:w="4536"/>
+          </w:tcPr>
+          <w:p>
+            <w:pPr>
+              <w:spacing w:before="40" w:after="40" w:line="264" w:lineRule="auto"/>
+            </w:pPr>
+          </w:p>
+        </w:tc>
+      </w:tr>
+    </w:tbl>
+    <w:p/>
+    <w:p>
+      <w:r>
+        <w:br w:type="page"/>
+      </w:r>
+    </w:p>
+    <w:p>
+      <w:pPr>
+        <w:spacing w:before="280" w:after="120" w:line="300" w:lineRule="auto"/>
+        <w:pBdr>
+          <w:bottom w:val="single" w:sz="6" w:space="4" w:color="D1D0CB"/>
+        </w:pBdr>
+      </w:pPr>
+      <w:r>
+        <w:rPr>
+          <w:rFonts w:ascii="Safira March" w:hAnsi="Safira March"/>
+          <w:color w:val="131237"/>
+          <w:sz w:val="28"/>
+        </w:rPr>
+        <w:t>Constancia de recepción</w:t>
+      </w:r>
+    </w:p>
+    <w:p>
+      <w:pPr>
+        <w:spacing w:before="0" w:after="120" w:line="300" w:lineRule="auto"/>
+      </w:pPr>
+      <w:r>
+        <w:rPr>
+          <w:rFonts w:ascii="Georgia" w:hAnsi="Georgia"/>
+          <w:b w:val="0"/>
+          <w:color w:val="2F2E47"/>
+          <w:sz w:val="21"/>
+        </w:rPr>
+        <w:t>Mediante mi firma, dejo constancia de haber recibido el comunicado «Lineamientos del Equipo Administrativo», con fecha 27 de octubre de 2026. Esta constancia acredita únicamente la recepción. No implica aceptación de modificaciones contractuales ni renuncia a derechos.</w:t>
+      </w:r>
+    </w:p>
+    <w:tbl>
+      <w:tblPr>
+        <w:tblW w:type="auto" w:w="0"/>
+        <w:jc w:val="center"/>
+        <w:tblLook w:firstColumn="1" w:firstRow="1" w:lastColumn="0" w:lastRow="0" w:noHBand="0" w:noVBand="1" w:val="04A0"/>
+        <w:tblBorders>
+          <w:top w:val="nil"/>
+          <w:left w:val="nil"/>
+          <w:bottom w:val="nil"/>
+          <w:right w:val="nil"/>
+          <w:insideH w:val="nil"/>
+          <w:insideV w:val="nil"/>
+        </w:tblBorders>
+      </w:tblPr>
+      <w:tblGrid>
+        <w:gridCol w:w="4536"/>
+        <w:gridCol w:w="4536"/>
+      </w:tblGrid>
+      <w:tr>
+        <w:tc>
+          <w:tcPr>
+            <w:tcW w:type="dxa" w:w="4536"/>
+          </w:tcPr>
+          <w:p>
+            <w:pPr>
+              <w:spacing w:before="40" w:after="40" w:line="264" w:lineRule="auto"/>
+            </w:pPr>
+            <w:r>
+              <w:rPr>
+                <w:rFonts w:ascii="Georgia" w:hAnsi="Georgia"/>
+                <w:b w:val="0"/>
+                <w:color w:val="5C6684"/>
+                <w:sz w:val="19"/>
+              </w:rPr>
+              <w:t>Nombre completo</w:t>
+            </w:r>
+          </w:p>
+        </w:tc>
+        <w:tc>
+          <w:tcPr>
+            <w:tcW w:type="dxa" w:w="4536"/>
           </w:tcPr>
           <w:p>
             <w:pPr>
@@ -1068,29 +1320,30 @@
             </w:r>
           </w:p>
         </w:tc>
+      </w:tr>
+      <w:tr>
         <w:tc>
           <w:tcPr>
-            <w:tcW w:type="dxa" w:w="2268"/>
+            <w:tcW w:type="dxa" w:w="4536"/>
           </w:tcPr>
           <w:p>
             <w:pPr>
               <w:spacing w:before="40" w:after="40" w:line="264" w:lineRule="auto"/>
             </w:pPr>
+            <w:r>
+              <w:rPr>
+                <w:rFonts w:ascii="Georgia" w:hAnsi="Georgia"/>
+                <w:b w:val="0"/>
+                <w:color w:val="5C6684"/>
+                <w:sz w:val="19"/>
+              </w:rPr>
+              <w:t>Cédula</w:t>
+            </w:r>
           </w:p>
         </w:tc>
         <w:tc>
           <w:tcPr>
-            <w:tcW w:type="dxa" w:w="2268"/>
-          </w:tcPr>
-          <w:p>
-            <w:pPr>
-              <w:spacing w:before="40" w:after="40" w:line="264" w:lineRule="auto"/>
-            </w:pPr>
-          </w:p>
-        </w:tc>
-        <w:tc>
-          <w:tcPr>
-            <w:tcW w:type="dxa" w:w="2268"/>
+            <w:tcW w:type="dxa" w:w="4536"/>
           </w:tcPr>
           <w:p>
             <w:pPr>
@@ -1102,7 +1355,26 @@
       <w:tr>
         <w:tc>
           <w:tcPr>
-            <w:tcW w:type="dxa" w:w="2268"/>
+            <w:tcW w:type="dxa" w:w="4536"/>
+          </w:tcPr>
+          <w:p>
+            <w:pPr>
+              <w:spacing w:before="40" w:after="40" w:line="264" w:lineRule="auto"/>
+            </w:pPr>
+            <w:r>
+              <w:rPr>
+                <w:rFonts w:ascii="Georgia" w:hAnsi="Georgia"/>
+                <w:b w:val="0"/>
+                <w:color w:val="5C6684"/>
+                <w:sz w:val="19"/>
+              </w:rPr>
+              <w:t>Fecha de recepción</w:t>
+            </w:r>
+          </w:p>
+        </w:tc>
+        <w:tc>
+          <w:tcPr>
+            <w:tcW w:type="dxa" w:w="4536"/>
           </w:tcPr>
           <w:p>
             <w:pPr>
@@ -1110,29 +1382,30 @@
             </w:pPr>
           </w:p>
         </w:tc>
+      </w:tr>
+      <w:tr>
         <w:tc>
           <w:tcPr>
-            <w:tcW w:type="dxa" w:w="2268"/>
+            <w:tcW w:type="dxa" w:w="4536"/>
           </w:tcPr>
           <w:p>
             <w:pPr>
               <w:spacing w:before="40" w:after="40" w:line="264" w:lineRule="auto"/>
             </w:pPr>
+            <w:r>
+              <w:rPr>
+                <w:rFonts w:ascii="Georgia" w:hAnsi="Georgia"/>
+                <w:b w:val="0"/>
+                <w:color w:val="5C6684"/>
+                <w:sz w:val="19"/>
+              </w:rPr>
+              <w:t>Firma</w:t>
+            </w:r>
           </w:p>
         </w:tc>
         <w:tc>
           <w:tcPr>
-            <w:tcW w:type="dxa" w:w="2268"/>
-          </w:tcPr>
-          <w:p>
-            <w:pPr>
-              <w:spacing w:before="40" w:after="40" w:line="264" w:lineRule="auto"/>
-            </w:pPr>
-          </w:p>
-        </w:tc>
-        <w:tc>
-          <w:tcPr>
-            <w:tcW w:type="dxa" w:w="2268"/>
+            <w:tcW w:type="dxa" w:w="4536"/>
           </w:tcPr>
           <w:p>
             <w:pPr>

</xml_diff>

<commit_message>
Comunicado: causa legal acreditada, derecho a asesoría sin represalias y firma con conocimiento de Dirección
Co-Authored-By: Claude Opus 5.5 <noreply@anthropic.com>
Claude-Session: https://claude.ai/code/session_01V7BfzBTA8TEWMK1apGBBKC
</commit_message>
<xml_diff>
--- a/casos/laboral-kcarmona/escritos/2026-10-26_Comunicado_Lineamientos_Equipo_Administrativo.docx
+++ b/casos/laboral-kcarmona/escritos/2026-10-26_Comunicado_Lineamientos_Equipo_Administrativo.docx
@@ -312,7 +312,7 @@
           <w:color w:val="2F2E47"/>
           <w:sz w:val="21"/>
         </w:rPr>
-        <w:t>Ante una duda, se verifica y se confirma; no se improvisa.</w:t>
+        <w:t>Ante una duda, se verifica y se confirma; es preferible confirmar un dato que comunicar información incorrecta.</w:t>
       </w:r>
     </w:p>
     <w:p>
@@ -478,7 +478,7 @@
           <w:color w:val="2F2E47"/>
           <w:sz w:val="21"/>
         </w:rPr>
-        <w:t>Nada de lo anterior limita el derecho de cada persona a plantear sus reclamos ante las instancias que la ley establece. Nadie será objeto de represalias por ejercer de buena fe sus derechos.</w:t>
+        <w:t>Nada de lo anterior limita el derecho de cada persona a plantear sus reclamos ante las instancias que la ley establece. Toda persona puede solicitar asesoramiento y acudir a las autoridades competentes, sin represalias por el ejercicio legítimo de sus derechos.</w:t>
       </w:r>
     </w:p>
     <w:p>
@@ -696,7 +696,7 @@
           <w:color w:val="2F2E47"/>
           <w:sz w:val="21"/>
         </w:rPr>
-        <w:t>En Poïesis, conforme al Código de Trabajo, los incumplimientos se atienden de forma objetiva, documentada y proporcional. Antes de cualquier medida se esclarecen los hechos y se escucha a la persona. Según el caso, puede tratarse de una conversación, una amonestación escrita u otra medida legalmente procedente. Una falta grave, o la reiteración de faltas ya advertidas, puede justificar la terminación del contrato sin responsabilidad patronal, siempre que se cumplan los requisitos legales.</w:t>
+        <w:t>En Poïesis, conforme al Código de Trabajo, los incumplimientos se atienden de forma objetiva, documentada y proporcional. Antes de cualquier medida se esclarecen los hechos y se escucha a la persona. Según el caso, puede tratarse de una conversación, una amonestación escrita u otra medida legalmente procedente. Cada situación se valora según su naturaleza, gravedad, circunstancias y antecedentes. La terminación del contrato sin responsabilidad patronal procede únicamente cuando existe una causa legal debidamente acreditada y se cumplen los requisitos aplicables.</w:t>
       </w:r>
     </w:p>
     <w:p>
@@ -846,6 +846,27 @@
                 <w:sz w:val="19"/>
               </w:rPr>
               <w:t>Asesoría Legal · Grupo Poïesis</w:t>
+            </w:r>
+          </w:p>
+        </w:tc>
+      </w:tr>
+      <w:tr>
+        <w:tc>
+          <w:tcPr>
+            <w:tcW w:type="dxa" w:w="9072"/>
+          </w:tcPr>
+          <w:p>
+            <w:pPr>
+              <w:spacing w:before="40" w:after="40" w:line="264" w:lineRule="auto"/>
+            </w:pPr>
+            <w:r>
+              <w:rPr>
+                <w:rFonts w:ascii="Georgia" w:hAnsi="Georgia"/>
+                <w:b w:val="0"/>
+                <w:color w:val="2F2E47"/>
+                <w:sz w:val="19"/>
+              </w:rPr>
+              <w:t>Con conocimiento de Dirección General</w:t>
             </w:r>
           </w:p>
         </w:tc>

</xml_diff>

<commit_message>
Comunicado: emite Dirección General, revisión jurídica de Asesoría Legal
Co-Authored-By: Claude Opus 5.5 <noreply@anthropic.com>
Claude-Session: https://claude.ai/code/session_01V7BfzBTA8TEWMK1apGBBKC
</commit_message>
<xml_diff>
--- a/casos/laboral-kcarmona/escritos/2026-10-26_Comunicado_Lineamientos_Equipo_Administrativo.docx
+++ b/casos/laboral-kcarmona/escritos/2026-10-26_Comunicado_Lineamientos_Equipo_Administrativo.docx
@@ -122,7 +122,7 @@
                 <w:color w:val="2F2E47"/>
                 <w:sz w:val="19"/>
               </w:rPr>
-              <w:t>Grupo Poïesis</w:t>
+              <w:t>Dirección General · Grupo Poïesis</w:t>
             </w:r>
           </w:p>
         </w:tc>
@@ -824,7 +824,7 @@
                 <w:color w:val="2F2E47"/>
                 <w:sz w:val="19"/>
               </w:rPr>
-              <w:t>Fressy Mora Peñaranda</w:t>
+              <w:t>Carlos Fernando Bonilla Cortés</w:t>
             </w:r>
           </w:p>
         </w:tc>
@@ -845,34 +845,27 @@
                 <w:color w:val="2F2E47"/>
                 <w:sz w:val="19"/>
               </w:rPr>
-              <w:t>Asesoría Legal · Grupo Poïesis</w:t>
-            </w:r>
-          </w:p>
-        </w:tc>
-      </w:tr>
-      <w:tr>
-        <w:tc>
-          <w:tcPr>
-            <w:tcW w:type="dxa" w:w="9072"/>
-          </w:tcPr>
-          <w:p>
-            <w:pPr>
-              <w:spacing w:before="40" w:after="40" w:line="264" w:lineRule="auto"/>
-            </w:pPr>
-            <w:r>
-              <w:rPr>
-                <w:rFonts w:ascii="Georgia" w:hAnsi="Georgia"/>
-                <w:b w:val="0"/>
-                <w:color w:val="2F2E47"/>
-                <w:sz w:val="19"/>
-              </w:rPr>
-              <w:t>Con conocimiento de Dirección General</w:t>
+              <w:t>Director General · Grupo Poïesis</w:t>
             </w:r>
           </w:p>
         </w:tc>
       </w:tr>
     </w:tbl>
     <w:p/>
+    <w:p>
+      <w:pPr>
+        <w:spacing w:before="0" w:after="120" w:line="300" w:lineRule="auto"/>
+      </w:pPr>
+      <w:r>
+        <w:rPr>
+          <w:rFonts w:ascii="Georgia" w:hAnsi="Georgia"/>
+          <w:b w:val="0"/>
+          <w:color w:val="2F2E47"/>
+          <w:sz w:val="21"/>
+        </w:rPr>
+        <w:t>Revisión jurídica: Fressy Mora Peñaranda · Asesoría Legal</w:t>
+      </w:r>
+    </w:p>
     <w:p>
       <w:r>
         <w:br w:type="page"/>
@@ -905,7 +898,7 @@
           <w:color w:val="2F2E47"/>
           <w:sz w:val="21"/>
         </w:rPr>
-        <w:t>Mediante mi firma, dejo constancia de haber recibido el comunicado «Lineamientos del Equipo Administrativo», con fecha 27 de octubre de 2026. Esta constancia acredita únicamente la recepción. No implica aceptación de modificaciones contractuales ni renuncia a derechos.</w:t>
+        <w:t>Mediante mi firma, dejo constancia de haber recibido el comunicado «Lineamientos del Equipo Administrativo», con fecha 27 de octubre de 2026. Esta constancia acredita únicamente la recepción. No implica aceptación de modificaciones contractuales ni renuncia a derechos laborales.</w:t>
       </w:r>
     </w:p>
     <w:tbl>
@@ -1093,7 +1086,7 @@
           <w:color w:val="2F2E47"/>
           <w:sz w:val="21"/>
         </w:rPr>
-        <w:t>Mediante mi firma, dejo constancia de haber recibido el comunicado «Lineamientos del Equipo Administrativo», con fecha 27 de octubre de 2026. Esta constancia acredita únicamente la recepción. No implica aceptación de modificaciones contractuales ni renuncia a derechos.</w:t>
+        <w:t>Mediante mi firma, dejo constancia de haber recibido el comunicado «Lineamientos del Equipo Administrativo», con fecha 27 de octubre de 2026. Esta constancia acredita únicamente la recepción. No implica aceptación de modificaciones contractuales ni renuncia a derechos laborales.</w:t>
       </w:r>
     </w:p>
     <w:tbl>
@@ -1281,7 +1274,7 @@
           <w:color w:val="2F2E47"/>
           <w:sz w:val="21"/>
         </w:rPr>
-        <w:t>Mediante mi firma, dejo constancia de haber recibido el comunicado «Lineamientos del Equipo Administrativo», con fecha 27 de octubre de 2026. Esta constancia acredita únicamente la recepción. No implica aceptación de modificaciones contractuales ni renuncia a derechos.</w:t>
+        <w:t>Mediante mi firma, dejo constancia de haber recibido el comunicado «Lineamientos del Equipo Administrativo», con fecha 27 de octubre de 2026. Esta constancia acredita únicamente la recepción. No implica aceptación de modificaciones contractuales ni renuncia a derechos laborales.</w:t>
       </w:r>
     </w:p>
     <w:tbl>

</xml_diff>

<commit_message>
Comunicado: críticas legítimas, facultades conforme a la ley, bloqueo justificado, excepciones legales a la confidencialidad y apartado de cumplimiento
Co-Authored-By: Claude Opus 5.5 <noreply@anthropic.com>
Claude-Session: https://claude.ai/code/session_01V7BfzBTA8TEWMK1apGBBKC
</commit_message>
<xml_diff>
--- a/casos/laboral-kcarmona/escritos/2026-10-26_Comunicado_Lineamientos_Equipo_Administrativo.docx
+++ b/casos/laboral-kcarmona/escritos/2026-10-26_Comunicado_Lineamientos_Equipo_Administrativo.docx
@@ -357,7 +357,7 @@
           <w:color w:val="2F2E47"/>
           <w:sz w:val="21"/>
         </w:rPr>
-        <w:t>Ninguna persona queda sin respuesta, y ningún número se bloquea sin autorización de la Dirección.</w:t>
+        <w:t>Ninguna persona queda sin respuesta. Los contactos no se bloquean ni se restringen de forma arbitraria: cualquier medida de ese tipo responde a un motivo legítimo, como amenazas, acoso o fraude, se documenta y se comunica a la Dirección.</w:t>
       </w:r>
     </w:p>
     <w:p>
@@ -418,7 +418,7 @@
           <w:color w:val="2F2E47"/>
           <w:sz w:val="21"/>
         </w:rPr>
-        <w:t>Las referencias a las compañeras y compañeros, a las jefaturas, a la Dirección y a la clínica se expresan con respeto, también en su ausencia.</w:t>
+        <w:t>Las relaciones entre compañeras, compañeros, jefaturas, Dirección y profesionales se desarrollan con respeto, también en ausencia de las personas y aun cuando existan diferencias de criterio. Las observaciones y los desacuerdos se expresan de manera profesional, sin perjuicio del derecho a reclamar o acudir a las autoridades competentes.</w:t>
       </w:r>
     </w:p>
     <w:p>
@@ -433,7 +433,7 @@
           <w:color w:val="2F2E47"/>
           <w:sz w:val="21"/>
         </w:rPr>
-        <w:t>Las decisiones sobre la incorporación y la permanencia de colaboradores y profesionales corresponden a la Dirección.</w:t>
+        <w:t>Las decisiones sobre la incorporación, la organización y la continuidad de las relaciones laborales y profesionales corresponden a las personas u órganos facultados, conforme a los contratos y a la ley.</w:t>
       </w:r>
     </w:p>
     <w:p>
@@ -509,7 +509,7 @@
           <w:color w:val="2F2E47"/>
           <w:sz w:val="21"/>
         </w:rPr>
-        <w:t>La información de pacientes y la información confidencial de la clínica (expedientes, agendas, datos de contacto, finanzas y documentos legales) se utiliza solo para fines de trabajo. No se copia, reenvía ni almacena fuera de los canales institucionales.</w:t>
+        <w:t>La información de pacientes y la información confidencial de la clínica (expedientes, agendas, datos de contacto, finanzas y documentos legales) se utiliza solo para fines de trabajo. No se copia, reenvía ni almacena fuera de los canales institucionales, salvo comunicaciones autorizadas por la ley o requerimientos de autoridad competente.</w:t>
       </w:r>
     </w:p>
     <w:p>
@@ -671,6 +671,20 @@
     </w:p>
     <w:p>
       <w:pPr>
+        <w:spacing w:before="0" w:after="120" w:line="300" w:lineRule="auto"/>
+      </w:pPr>
+      <w:r>
+        <w:rPr>
+          <w:rFonts w:ascii="Georgia" w:hAnsi="Georgia"/>
+          <w:b w:val="0"/>
+          <w:color w:val="2F2E47"/>
+          <w:sz w:val="21"/>
+        </w:rPr>
+        <w:t>Las consultas sobre la colilla, las deducciones y demás aspectos individuales del salario se atienden directamente y en privado.</w:t>
+      </w:r>
+    </w:p>
+    <w:p>
+      <w:pPr>
         <w:spacing w:before="280" w:after="120" w:line="300" w:lineRule="auto"/>
         <w:pBdr>
           <w:bottom w:val="single" w:sz="6" w:space="4" w:color="D1D0CB"/>
@@ -682,7 +696,7 @@
           <w:color w:val="131237"/>
           <w:sz w:val="28"/>
         </w:rPr>
-        <w:t>5. Un marco claro</w:t>
+        <w:t>5. Responsabilidad y cumplimiento</w:t>
       </w:r>
     </w:p>
     <w:p>
@@ -696,7 +710,7 @@
           <w:color w:val="2F2E47"/>
           <w:sz w:val="21"/>
         </w:rPr>
-        <w:t>En Poïesis, conforme al Código de Trabajo, los incumplimientos se atienden de forma objetiva, documentada y proporcional. Antes de cualquier medida se esclarecen los hechos y se escucha a la persona. Según el caso, puede tratarse de una conversación, una amonestación escrita u otra medida legalmente procedente. Cada situación se valora según su naturaleza, gravedad, circunstancias y antecedentes. La terminación del contrato sin responsabilidad patronal procede únicamente cuando existe una causa legal debidamente acreditada y se cumplen los requisitos aplicables.</w:t>
+        <w:t>El cumplimiento responsable de nuestras funciones y protocolos sostiene la calidad de la atención y el bienestar del equipo.</w:t>
       </w:r>
     </w:p>
     <w:p>
@@ -710,7 +724,7 @@
           <w:color w:val="2F2E47"/>
           <w:sz w:val="21"/>
         </w:rPr>
-        <w:t>Ninguna sanción es automática. Ejercer derechos laborales, presentar un reclamo o no aceptar una modificación contractual no constituyen faltas.</w:t>
+        <w:t>Cuando surjan dificultades o posibles incumplimientos, cada situación se valora de manera objetiva, documentada y proporcional, según su naturaleza, gravedad, circunstancias y antecedentes. Se escucha la versión de la persona y, cuando corresponda, se aplican medidas correctivas o disciplinarias conforme a la legislación laboral. La terminación del contrato sin responsabilidad patronal procede únicamente cuando existe una causa legal debidamente acreditada y se cumplen los requisitos aplicables.</w:t>
       </w:r>
     </w:p>
     <w:p>
@@ -724,7 +738,21 @@
           <w:color w:val="2F2E47"/>
           <w:sz w:val="21"/>
         </w:rPr>
-        <w:t>Lo compartimos por transparencia, para que todas las personas conozcan el marco con la misma claridad. Nuestro interés es que no sea necesario aplicarlo, y confiamos en que así será.</w:t>
+        <w:t>Ninguna sanción es automática. Ejercer derechos laborales, presentar un reclamo o no aceptar una modificación contractual no constituyen, por sí mismos, faltas.</w:t>
+      </w:r>
+    </w:p>
+    <w:p>
+      <w:pPr>
+        <w:spacing w:before="0" w:after="120" w:line="300" w:lineRule="auto"/>
+      </w:pPr>
+      <w:r>
+        <w:rPr>
+          <w:rFonts w:ascii="Georgia" w:hAnsi="Georgia"/>
+          <w:b w:val="0"/>
+          <w:color w:val="2F2E47"/>
+          <w:sz w:val="21"/>
+        </w:rPr>
+        <w:t>Lo compartimos por transparencia, para que todas las personas conozcan el marco con la misma claridad. Nuestro interés es prevenir dificultades y resolverlas a tiempo, con diálogo y respeto mutuo.</w:t>
       </w:r>
     </w:p>
     <w:p>

</xml_diff>

<commit_message>
Comunicado en PDF, sin «Confidencial», sin constancias de recepción ni firma personal
Co-Authored-By: Claude Opus 5.5 <noreply@anthropic.com>
Claude-Session: https://claude.ai/code/session_01V7BfzBTA8TEWMK1apGBBKC
</commit_message>
<xml_diff>
--- a/casos/laboral-kcarmona/escritos/2026-10-26_Comunicado_Lineamientos_Equipo_Administrativo.docx
+++ b/casos/laboral-kcarmona/escritos/2026-10-26_Comunicado_Lineamientos_Equipo_Administrativo.docx
@@ -799,89 +799,20 @@
         <w:t>Con aprecio,</w:t>
       </w:r>
     </w:p>
-    <w:p/>
-    <w:tbl>
-      <w:tblPr>
-        <w:tblW w:type="auto" w:w="0"/>
-        <w:jc w:val="center"/>
-        <w:tblLook w:firstColumn="1" w:firstRow="1" w:lastColumn="0" w:lastRow="0" w:noHBand="0" w:noVBand="1" w:val="04A0"/>
-        <w:tblBorders>
-          <w:top w:val="nil"/>
-          <w:left w:val="nil"/>
-          <w:bottom w:val="nil"/>
-          <w:right w:val="nil"/>
-          <w:insideH w:val="nil"/>
-          <w:insideV w:val="nil"/>
-        </w:tblBorders>
-      </w:tblPr>
-      <w:tblGrid>
-        <w:gridCol w:w="9072"/>
-      </w:tblGrid>
-      <w:tr>
-        <w:tc>
-          <w:tcPr>
-            <w:tcW w:type="dxa" w:w="9072"/>
-          </w:tcPr>
-          <w:p>
-            <w:pPr>
-              <w:spacing w:before="40" w:after="40" w:line="264" w:lineRule="auto"/>
-            </w:pPr>
-            <w:r>
-              <w:rPr>
-                <w:rFonts w:ascii="Georgia" w:hAnsi="Georgia"/>
-                <w:b w:val="0"/>
-                <w:color w:val="2F2E47"/>
-                <w:sz w:val="19"/>
-              </w:rPr>
-              <w:t>______________________________</w:t>
-            </w:r>
-          </w:p>
-        </w:tc>
-      </w:tr>
-      <w:tr>
-        <w:tc>
-          <w:tcPr>
-            <w:tcW w:type="dxa" w:w="9072"/>
-          </w:tcPr>
-          <w:p>
-            <w:pPr>
-              <w:spacing w:before="40" w:after="40" w:line="264" w:lineRule="auto"/>
-            </w:pPr>
-            <w:r>
-              <w:rPr>
-                <w:rFonts w:ascii="Georgia" w:hAnsi="Georgia"/>
-                <w:b w:val="0"/>
-                <w:color w:val="2F2E47"/>
-                <w:sz w:val="19"/>
-              </w:rPr>
-              <w:t>Carlos Fernando Bonilla Cortés</w:t>
-            </w:r>
-          </w:p>
-        </w:tc>
-      </w:tr>
-      <w:tr>
-        <w:tc>
-          <w:tcPr>
-            <w:tcW w:type="dxa" w:w="9072"/>
-          </w:tcPr>
-          <w:p>
-            <w:pPr>
-              <w:spacing w:before="40" w:after="40" w:line="264" w:lineRule="auto"/>
-            </w:pPr>
-            <w:r>
-              <w:rPr>
-                <w:rFonts w:ascii="Georgia" w:hAnsi="Georgia"/>
-                <w:b w:val="0"/>
-                <w:color w:val="2F2E47"/>
-                <w:sz w:val="19"/>
-              </w:rPr>
-              <w:t>Director General · Grupo Poïesis</w:t>
-            </w:r>
-          </w:p>
-        </w:tc>
-      </w:tr>
-    </w:tbl>
-    <w:p/>
+    <w:p>
+      <w:pPr>
+        <w:spacing w:before="0" w:after="120" w:line="300" w:lineRule="auto"/>
+      </w:pPr>
+      <w:r>
+        <w:rPr>
+          <w:rFonts w:ascii="Georgia" w:hAnsi="Georgia"/>
+          <w:b w:val="0"/>
+          <w:color w:val="2F2E47"/>
+          <w:sz w:val="21"/>
+        </w:rPr>
+        <w:t>Dirección General · Grupo Poïesis</w:t>
+      </w:r>
+    </w:p>
     <w:p>
       <w:pPr>
         <w:spacing w:before="0" w:after="120" w:line="300" w:lineRule="auto"/>
@@ -896,570 +827,6 @@
         <w:t>Revisión jurídica: Fressy Mora Peñaranda · Asesoría Legal</w:t>
       </w:r>
     </w:p>
-    <w:p>
-      <w:r>
-        <w:br w:type="page"/>
-      </w:r>
-    </w:p>
-    <w:p>
-      <w:pPr>
-        <w:spacing w:before="280" w:after="120" w:line="300" w:lineRule="auto"/>
-        <w:pBdr>
-          <w:bottom w:val="single" w:sz="6" w:space="4" w:color="D1D0CB"/>
-        </w:pBdr>
-      </w:pPr>
-      <w:r>
-        <w:rPr>
-          <w:rFonts w:ascii="Safira March" w:hAnsi="Safira March"/>
-          <w:color w:val="131237"/>
-          <w:sz w:val="28"/>
-        </w:rPr>
-        <w:t>Constancia de recepción</w:t>
-      </w:r>
-    </w:p>
-    <w:p>
-      <w:pPr>
-        <w:spacing w:before="0" w:after="120" w:line="300" w:lineRule="auto"/>
-      </w:pPr>
-      <w:r>
-        <w:rPr>
-          <w:rFonts w:ascii="Georgia" w:hAnsi="Georgia"/>
-          <w:b w:val="0"/>
-          <w:color w:val="2F2E47"/>
-          <w:sz w:val="21"/>
-        </w:rPr>
-        <w:t>Mediante mi firma, dejo constancia de haber recibido el comunicado «Lineamientos del Equipo Administrativo», con fecha 27 de octubre de 2026. Esta constancia acredita únicamente la recepción. No implica aceptación de modificaciones contractuales ni renuncia a derechos laborales.</w:t>
-      </w:r>
-    </w:p>
-    <w:tbl>
-      <w:tblPr>
-        <w:tblW w:type="auto" w:w="0"/>
-        <w:jc w:val="center"/>
-        <w:tblLook w:firstColumn="1" w:firstRow="1" w:lastColumn="0" w:lastRow="0" w:noHBand="0" w:noVBand="1" w:val="04A0"/>
-        <w:tblBorders>
-          <w:top w:val="nil"/>
-          <w:left w:val="nil"/>
-          <w:bottom w:val="nil"/>
-          <w:right w:val="nil"/>
-          <w:insideH w:val="nil"/>
-          <w:insideV w:val="nil"/>
-        </w:tblBorders>
-      </w:tblPr>
-      <w:tblGrid>
-        <w:gridCol w:w="4536"/>
-        <w:gridCol w:w="4536"/>
-      </w:tblGrid>
-      <w:tr>
-        <w:tc>
-          <w:tcPr>
-            <w:tcW w:type="dxa" w:w="4536"/>
-          </w:tcPr>
-          <w:p>
-            <w:pPr>
-              <w:spacing w:before="40" w:after="40" w:line="264" w:lineRule="auto"/>
-            </w:pPr>
-            <w:r>
-              <w:rPr>
-                <w:rFonts w:ascii="Georgia" w:hAnsi="Georgia"/>
-                <w:b w:val="0"/>
-                <w:color w:val="5C6684"/>
-                <w:sz w:val="19"/>
-              </w:rPr>
-              <w:t>Nombre completo</w:t>
-            </w:r>
-          </w:p>
-        </w:tc>
-        <w:tc>
-          <w:tcPr>
-            <w:tcW w:type="dxa" w:w="4536"/>
-          </w:tcPr>
-          <w:p>
-            <w:pPr>
-              <w:spacing w:before="40" w:after="40" w:line="264" w:lineRule="auto"/>
-            </w:pPr>
-            <w:r>
-              <w:rPr>
-                <w:rFonts w:ascii="Georgia" w:hAnsi="Georgia"/>
-                <w:b w:val="0"/>
-                <w:color w:val="2F2E47"/>
-                <w:sz w:val="19"/>
-              </w:rPr>
-              <w:t>Kristell Carmona Soto</w:t>
-            </w:r>
-          </w:p>
-        </w:tc>
-      </w:tr>
-      <w:tr>
-        <w:tc>
-          <w:tcPr>
-            <w:tcW w:type="dxa" w:w="4536"/>
-          </w:tcPr>
-          <w:p>
-            <w:pPr>
-              <w:spacing w:before="40" w:after="40" w:line="264" w:lineRule="auto"/>
-            </w:pPr>
-            <w:r>
-              <w:rPr>
-                <w:rFonts w:ascii="Georgia" w:hAnsi="Georgia"/>
-                <w:b w:val="0"/>
-                <w:color w:val="5C6684"/>
-                <w:sz w:val="19"/>
-              </w:rPr>
-              <w:t>Cédula</w:t>
-            </w:r>
-          </w:p>
-        </w:tc>
-        <w:tc>
-          <w:tcPr>
-            <w:tcW w:type="dxa" w:w="4536"/>
-          </w:tcPr>
-          <w:p>
-            <w:pPr>
-              <w:spacing w:before="40" w:after="40" w:line="264" w:lineRule="auto"/>
-            </w:pPr>
-          </w:p>
-        </w:tc>
-      </w:tr>
-      <w:tr>
-        <w:tc>
-          <w:tcPr>
-            <w:tcW w:type="dxa" w:w="4536"/>
-          </w:tcPr>
-          <w:p>
-            <w:pPr>
-              <w:spacing w:before="40" w:after="40" w:line="264" w:lineRule="auto"/>
-            </w:pPr>
-            <w:r>
-              <w:rPr>
-                <w:rFonts w:ascii="Georgia" w:hAnsi="Georgia"/>
-                <w:b w:val="0"/>
-                <w:color w:val="5C6684"/>
-                <w:sz w:val="19"/>
-              </w:rPr>
-              <w:t>Fecha de recepción</w:t>
-            </w:r>
-          </w:p>
-        </w:tc>
-        <w:tc>
-          <w:tcPr>
-            <w:tcW w:type="dxa" w:w="4536"/>
-          </w:tcPr>
-          <w:p>
-            <w:pPr>
-              <w:spacing w:before="40" w:after="40" w:line="264" w:lineRule="auto"/>
-            </w:pPr>
-          </w:p>
-        </w:tc>
-      </w:tr>
-      <w:tr>
-        <w:tc>
-          <w:tcPr>
-            <w:tcW w:type="dxa" w:w="4536"/>
-          </w:tcPr>
-          <w:p>
-            <w:pPr>
-              <w:spacing w:before="40" w:after="40" w:line="264" w:lineRule="auto"/>
-            </w:pPr>
-            <w:r>
-              <w:rPr>
-                <w:rFonts w:ascii="Georgia" w:hAnsi="Georgia"/>
-                <w:b w:val="0"/>
-                <w:color w:val="5C6684"/>
-                <w:sz w:val="19"/>
-              </w:rPr>
-              <w:t>Firma</w:t>
-            </w:r>
-          </w:p>
-        </w:tc>
-        <w:tc>
-          <w:tcPr>
-            <w:tcW w:type="dxa" w:w="4536"/>
-          </w:tcPr>
-          <w:p>
-            <w:pPr>
-              <w:spacing w:before="40" w:after="40" w:line="264" w:lineRule="auto"/>
-            </w:pPr>
-          </w:p>
-        </w:tc>
-      </w:tr>
-    </w:tbl>
-    <w:p/>
-    <w:p>
-      <w:r>
-        <w:br w:type="page"/>
-      </w:r>
-    </w:p>
-    <w:p>
-      <w:pPr>
-        <w:spacing w:before="280" w:after="120" w:line="300" w:lineRule="auto"/>
-        <w:pBdr>
-          <w:bottom w:val="single" w:sz="6" w:space="4" w:color="D1D0CB"/>
-        </w:pBdr>
-      </w:pPr>
-      <w:r>
-        <w:rPr>
-          <w:rFonts w:ascii="Safira March" w:hAnsi="Safira March"/>
-          <w:color w:val="131237"/>
-          <w:sz w:val="28"/>
-        </w:rPr>
-        <w:t>Constancia de recepción</w:t>
-      </w:r>
-    </w:p>
-    <w:p>
-      <w:pPr>
-        <w:spacing w:before="0" w:after="120" w:line="300" w:lineRule="auto"/>
-      </w:pPr>
-      <w:r>
-        <w:rPr>
-          <w:rFonts w:ascii="Georgia" w:hAnsi="Georgia"/>
-          <w:b w:val="0"/>
-          <w:color w:val="2F2E47"/>
-          <w:sz w:val="21"/>
-        </w:rPr>
-        <w:t>Mediante mi firma, dejo constancia de haber recibido el comunicado «Lineamientos del Equipo Administrativo», con fecha 27 de octubre de 2026. Esta constancia acredita únicamente la recepción. No implica aceptación de modificaciones contractuales ni renuncia a derechos laborales.</w:t>
-      </w:r>
-    </w:p>
-    <w:tbl>
-      <w:tblPr>
-        <w:tblW w:type="auto" w:w="0"/>
-        <w:jc w:val="center"/>
-        <w:tblLook w:firstColumn="1" w:firstRow="1" w:lastColumn="0" w:lastRow="0" w:noHBand="0" w:noVBand="1" w:val="04A0"/>
-        <w:tblBorders>
-          <w:top w:val="nil"/>
-          <w:left w:val="nil"/>
-          <w:bottom w:val="nil"/>
-          <w:right w:val="nil"/>
-          <w:insideH w:val="nil"/>
-          <w:insideV w:val="nil"/>
-        </w:tblBorders>
-      </w:tblPr>
-      <w:tblGrid>
-        <w:gridCol w:w="4536"/>
-        <w:gridCol w:w="4536"/>
-      </w:tblGrid>
-      <w:tr>
-        <w:tc>
-          <w:tcPr>
-            <w:tcW w:type="dxa" w:w="4536"/>
-          </w:tcPr>
-          <w:p>
-            <w:pPr>
-              <w:spacing w:before="40" w:after="40" w:line="264" w:lineRule="auto"/>
-            </w:pPr>
-            <w:r>
-              <w:rPr>
-                <w:rFonts w:ascii="Georgia" w:hAnsi="Georgia"/>
-                <w:b w:val="0"/>
-                <w:color w:val="5C6684"/>
-                <w:sz w:val="19"/>
-              </w:rPr>
-              <w:t>Nombre completo</w:t>
-            </w:r>
-          </w:p>
-        </w:tc>
-        <w:tc>
-          <w:tcPr>
-            <w:tcW w:type="dxa" w:w="4536"/>
-          </w:tcPr>
-          <w:p>
-            <w:pPr>
-              <w:spacing w:before="40" w:after="40" w:line="264" w:lineRule="auto"/>
-            </w:pPr>
-            <w:r>
-              <w:rPr>
-                <w:rFonts w:ascii="Georgia" w:hAnsi="Georgia"/>
-                <w:b w:val="0"/>
-                <w:color w:val="2F2E47"/>
-                <w:sz w:val="19"/>
-              </w:rPr>
-              <w:t>Fiorella Varela Monge</w:t>
-            </w:r>
-          </w:p>
-        </w:tc>
-      </w:tr>
-      <w:tr>
-        <w:tc>
-          <w:tcPr>
-            <w:tcW w:type="dxa" w:w="4536"/>
-          </w:tcPr>
-          <w:p>
-            <w:pPr>
-              <w:spacing w:before="40" w:after="40" w:line="264" w:lineRule="auto"/>
-            </w:pPr>
-            <w:r>
-              <w:rPr>
-                <w:rFonts w:ascii="Georgia" w:hAnsi="Georgia"/>
-                <w:b w:val="0"/>
-                <w:color w:val="5C6684"/>
-                <w:sz w:val="19"/>
-              </w:rPr>
-              <w:t>Cédula</w:t>
-            </w:r>
-          </w:p>
-        </w:tc>
-        <w:tc>
-          <w:tcPr>
-            <w:tcW w:type="dxa" w:w="4536"/>
-          </w:tcPr>
-          <w:p>
-            <w:pPr>
-              <w:spacing w:before="40" w:after="40" w:line="264" w:lineRule="auto"/>
-            </w:pPr>
-          </w:p>
-        </w:tc>
-      </w:tr>
-      <w:tr>
-        <w:tc>
-          <w:tcPr>
-            <w:tcW w:type="dxa" w:w="4536"/>
-          </w:tcPr>
-          <w:p>
-            <w:pPr>
-              <w:spacing w:before="40" w:after="40" w:line="264" w:lineRule="auto"/>
-            </w:pPr>
-            <w:r>
-              <w:rPr>
-                <w:rFonts w:ascii="Georgia" w:hAnsi="Georgia"/>
-                <w:b w:val="0"/>
-                <w:color w:val="5C6684"/>
-                <w:sz w:val="19"/>
-              </w:rPr>
-              <w:t>Fecha de recepción</w:t>
-            </w:r>
-          </w:p>
-        </w:tc>
-        <w:tc>
-          <w:tcPr>
-            <w:tcW w:type="dxa" w:w="4536"/>
-          </w:tcPr>
-          <w:p>
-            <w:pPr>
-              <w:spacing w:before="40" w:after="40" w:line="264" w:lineRule="auto"/>
-            </w:pPr>
-          </w:p>
-        </w:tc>
-      </w:tr>
-      <w:tr>
-        <w:tc>
-          <w:tcPr>
-            <w:tcW w:type="dxa" w:w="4536"/>
-          </w:tcPr>
-          <w:p>
-            <w:pPr>
-              <w:spacing w:before="40" w:after="40" w:line="264" w:lineRule="auto"/>
-            </w:pPr>
-            <w:r>
-              <w:rPr>
-                <w:rFonts w:ascii="Georgia" w:hAnsi="Georgia"/>
-                <w:b w:val="0"/>
-                <w:color w:val="5C6684"/>
-                <w:sz w:val="19"/>
-              </w:rPr>
-              <w:t>Firma</w:t>
-            </w:r>
-          </w:p>
-        </w:tc>
-        <w:tc>
-          <w:tcPr>
-            <w:tcW w:type="dxa" w:w="4536"/>
-          </w:tcPr>
-          <w:p>
-            <w:pPr>
-              <w:spacing w:before="40" w:after="40" w:line="264" w:lineRule="auto"/>
-            </w:pPr>
-          </w:p>
-        </w:tc>
-      </w:tr>
-    </w:tbl>
-    <w:p/>
-    <w:p>
-      <w:r>
-        <w:br w:type="page"/>
-      </w:r>
-    </w:p>
-    <w:p>
-      <w:pPr>
-        <w:spacing w:before="280" w:after="120" w:line="300" w:lineRule="auto"/>
-        <w:pBdr>
-          <w:bottom w:val="single" w:sz="6" w:space="4" w:color="D1D0CB"/>
-        </w:pBdr>
-      </w:pPr>
-      <w:r>
-        <w:rPr>
-          <w:rFonts w:ascii="Safira March" w:hAnsi="Safira March"/>
-          <w:color w:val="131237"/>
-          <w:sz w:val="28"/>
-        </w:rPr>
-        <w:t>Constancia de recepción</w:t>
-      </w:r>
-    </w:p>
-    <w:p>
-      <w:pPr>
-        <w:spacing w:before="0" w:after="120" w:line="300" w:lineRule="auto"/>
-      </w:pPr>
-      <w:r>
-        <w:rPr>
-          <w:rFonts w:ascii="Georgia" w:hAnsi="Georgia"/>
-          <w:b w:val="0"/>
-          <w:color w:val="2F2E47"/>
-          <w:sz w:val="21"/>
-        </w:rPr>
-        <w:t>Mediante mi firma, dejo constancia de haber recibido el comunicado «Lineamientos del Equipo Administrativo», con fecha 27 de octubre de 2026. Esta constancia acredita únicamente la recepción. No implica aceptación de modificaciones contractuales ni renuncia a derechos laborales.</w:t>
-      </w:r>
-    </w:p>
-    <w:tbl>
-      <w:tblPr>
-        <w:tblW w:type="auto" w:w="0"/>
-        <w:jc w:val="center"/>
-        <w:tblLook w:firstColumn="1" w:firstRow="1" w:lastColumn="0" w:lastRow="0" w:noHBand="0" w:noVBand="1" w:val="04A0"/>
-        <w:tblBorders>
-          <w:top w:val="nil"/>
-          <w:left w:val="nil"/>
-          <w:bottom w:val="nil"/>
-          <w:right w:val="nil"/>
-          <w:insideH w:val="nil"/>
-          <w:insideV w:val="nil"/>
-        </w:tblBorders>
-      </w:tblPr>
-      <w:tblGrid>
-        <w:gridCol w:w="4536"/>
-        <w:gridCol w:w="4536"/>
-      </w:tblGrid>
-      <w:tr>
-        <w:tc>
-          <w:tcPr>
-            <w:tcW w:type="dxa" w:w="4536"/>
-          </w:tcPr>
-          <w:p>
-            <w:pPr>
-              <w:spacing w:before="40" w:after="40" w:line="264" w:lineRule="auto"/>
-            </w:pPr>
-            <w:r>
-              <w:rPr>
-                <w:rFonts w:ascii="Georgia" w:hAnsi="Georgia"/>
-                <w:b w:val="0"/>
-                <w:color w:val="5C6684"/>
-                <w:sz w:val="19"/>
-              </w:rPr>
-              <w:t>Nombre completo</w:t>
-            </w:r>
-          </w:p>
-        </w:tc>
-        <w:tc>
-          <w:tcPr>
-            <w:tcW w:type="dxa" w:w="4536"/>
-          </w:tcPr>
-          <w:p>
-            <w:pPr>
-              <w:spacing w:before="40" w:after="40" w:line="264" w:lineRule="auto"/>
-            </w:pPr>
-            <w:r>
-              <w:rPr>
-                <w:rFonts w:ascii="Georgia" w:hAnsi="Georgia"/>
-                <w:b w:val="0"/>
-                <w:color w:val="2F2E47"/>
-                <w:sz w:val="19"/>
-              </w:rPr>
-              <w:t>Angiolette Alcázar Mata</w:t>
-            </w:r>
-          </w:p>
-        </w:tc>
-      </w:tr>
-      <w:tr>
-        <w:tc>
-          <w:tcPr>
-            <w:tcW w:type="dxa" w:w="4536"/>
-          </w:tcPr>
-          <w:p>
-            <w:pPr>
-              <w:spacing w:before="40" w:after="40" w:line="264" w:lineRule="auto"/>
-            </w:pPr>
-            <w:r>
-              <w:rPr>
-                <w:rFonts w:ascii="Georgia" w:hAnsi="Georgia"/>
-                <w:b w:val="0"/>
-                <w:color w:val="5C6684"/>
-                <w:sz w:val="19"/>
-              </w:rPr>
-              <w:t>Cédula</w:t>
-            </w:r>
-          </w:p>
-        </w:tc>
-        <w:tc>
-          <w:tcPr>
-            <w:tcW w:type="dxa" w:w="4536"/>
-          </w:tcPr>
-          <w:p>
-            <w:pPr>
-              <w:spacing w:before="40" w:after="40" w:line="264" w:lineRule="auto"/>
-            </w:pPr>
-          </w:p>
-        </w:tc>
-      </w:tr>
-      <w:tr>
-        <w:tc>
-          <w:tcPr>
-            <w:tcW w:type="dxa" w:w="4536"/>
-          </w:tcPr>
-          <w:p>
-            <w:pPr>
-              <w:spacing w:before="40" w:after="40" w:line="264" w:lineRule="auto"/>
-            </w:pPr>
-            <w:r>
-              <w:rPr>
-                <w:rFonts w:ascii="Georgia" w:hAnsi="Georgia"/>
-                <w:b w:val="0"/>
-                <w:color w:val="5C6684"/>
-                <w:sz w:val="19"/>
-              </w:rPr>
-              <w:t>Fecha de recepción</w:t>
-            </w:r>
-          </w:p>
-        </w:tc>
-        <w:tc>
-          <w:tcPr>
-            <w:tcW w:type="dxa" w:w="4536"/>
-          </w:tcPr>
-          <w:p>
-            <w:pPr>
-              <w:spacing w:before="40" w:after="40" w:line="264" w:lineRule="auto"/>
-            </w:pPr>
-          </w:p>
-        </w:tc>
-      </w:tr>
-      <w:tr>
-        <w:tc>
-          <w:tcPr>
-            <w:tcW w:type="dxa" w:w="4536"/>
-          </w:tcPr>
-          <w:p>
-            <w:pPr>
-              <w:spacing w:before="40" w:after="40" w:line="264" w:lineRule="auto"/>
-            </w:pPr>
-            <w:r>
-              <w:rPr>
-                <w:rFonts w:ascii="Georgia" w:hAnsi="Georgia"/>
-                <w:b w:val="0"/>
-                <w:color w:val="5C6684"/>
-                <w:sz w:val="19"/>
-              </w:rPr>
-              <w:t>Firma</w:t>
-            </w:r>
-          </w:p>
-        </w:tc>
-        <w:tc>
-          <w:tcPr>
-            <w:tcW w:type="dxa" w:w="4536"/>
-          </w:tcPr>
-          <w:p>
-            <w:pPr>
-              <w:spacing w:before="40" w:after="40" w:line="264" w:lineRule="auto"/>
-            </w:pPr>
-          </w:p>
-        </w:tc>
-      </w:tr>
-    </w:tbl>
-    <w:p/>
     <w:sectPr>
       <w:headerReference w:type="default" r:id="rId9"/>
       <w:footerReference w:type="default" r:id="rId10"/>
@@ -1555,7 +922,7 @@
         <w:color w:val="5C6684"/>
         <w:sz w:val="17"/>
       </w:rPr>
-      <w:t>Grupo Poïesis · Confidencial</w:t>
+      <w:t>Grupo Poïesis</w:t>
     </w:r>
   </w:p>
 </w:hdr>

</xml_diff>

<commit_message>
Comunicado sin bloque de firma al final
Co-Authored-By: Claude Opus 5.5 <noreply@anthropic.com>
Claude-Session: https://claude.ai/code/session_01V7BfzBTA8TEWMK1apGBBKC
</commit_message>
<xml_diff>
--- a/casos/laboral-kcarmona/escritos/2026-10-26_Comunicado_Lineamientos_Equipo_Administrativo.docx
+++ b/casos/laboral-kcarmona/escritos/2026-10-26_Comunicado_Lineamientos_Equipo_Administrativo.docx
@@ -785,48 +785,6 @@
         <w:t>Gracias por el cuidado con que cada persona sostiene su trabajo. Quedamos a disposición para conversar sobre cualquiera de estos puntos.</w:t>
       </w:r>
     </w:p>
-    <w:p>
-      <w:pPr>
-        <w:spacing w:before="0" w:after="120" w:line="300" w:lineRule="auto"/>
-      </w:pPr>
-      <w:r>
-        <w:rPr>
-          <w:rFonts w:ascii="Georgia" w:hAnsi="Georgia"/>
-          <w:b w:val="0"/>
-          <w:color w:val="2F2E47"/>
-          <w:sz w:val="21"/>
-        </w:rPr>
-        <w:t>Con aprecio,</w:t>
-      </w:r>
-    </w:p>
-    <w:p>
-      <w:pPr>
-        <w:spacing w:before="0" w:after="120" w:line="300" w:lineRule="auto"/>
-      </w:pPr>
-      <w:r>
-        <w:rPr>
-          <w:rFonts w:ascii="Georgia" w:hAnsi="Georgia"/>
-          <w:b w:val="0"/>
-          <w:color w:val="2F2E47"/>
-          <w:sz w:val="21"/>
-        </w:rPr>
-        <w:t>Dirección General · Grupo Poïesis</w:t>
-      </w:r>
-    </w:p>
-    <w:p>
-      <w:pPr>
-        <w:spacing w:before="0" w:after="120" w:line="300" w:lineRule="auto"/>
-      </w:pPr>
-      <w:r>
-        <w:rPr>
-          <w:rFonts w:ascii="Georgia" w:hAnsi="Georgia"/>
-          <w:b w:val="0"/>
-          <w:color w:val="2F2E47"/>
-          <w:sz w:val="21"/>
-        </w:rPr>
-        <w:t>Revisión jurídica: Fressy Mora Peñaranda · Asesoría Legal</w:t>
-      </w:r>
-    </w:p>
     <w:sectPr>
       <w:headerReference w:type="default" r:id="rId9"/>
       <w:footerReference w:type="default" r:id="rId10"/>

</xml_diff>

<commit_message>
Contratos marco v2 con la valoración externa; Angiolette: herramientas digitales; títulos unidos a su párrafo
Co-Authored-By: Claude Opus 5.5 <noreply@anthropic.com>
Claude-Session: https://claude.ai/code/session_01V7BfzBTA8TEWMK1apGBBKC
</commit_message>
<xml_diff>
--- a/casos/laboral-kcarmona/escritos/2026-10-26_Comunicado_Lineamientos_Equipo_Administrativo.docx
+++ b/casos/laboral-kcarmona/escritos/2026-10-26_Comunicado_Lineamientos_Equipo_Administrativo.docx
@@ -215,6 +215,7 @@
     </w:p>
     <w:p>
       <w:pPr>
+        <w:keepNext/>
         <w:spacing w:before="280" w:after="120" w:line="300" w:lineRule="auto"/>
         <w:pBdr>
           <w:bottom w:val="single" w:sz="6" w:space="4" w:color="D1D0CB"/>
@@ -394,6 +395,7 @@
     </w:p>
     <w:p>
       <w:pPr>
+        <w:keepNext/>
         <w:spacing w:before="280" w:after="120" w:line="300" w:lineRule="auto"/>
         <w:pBdr>
           <w:bottom w:val="single" w:sz="6" w:space="4" w:color="D1D0CB"/>
@@ -485,6 +487,7 @@
     </w:p>
     <w:p>
       <w:pPr>
+        <w:keepNext/>
         <w:spacing w:before="280" w:after="120" w:line="300" w:lineRule="auto"/>
         <w:pBdr>
           <w:bottom w:val="single" w:sz="6" w:space="4" w:color="D1D0CB"/>
@@ -561,6 +564,7 @@
     </w:p>
     <w:p>
       <w:pPr>
+        <w:keepNext/>
         <w:spacing w:before="280" w:after="120" w:line="300" w:lineRule="auto"/>
         <w:pBdr>
           <w:bottom w:val="single" w:sz="6" w:space="4" w:color="D1D0CB"/>
@@ -687,6 +691,7 @@
     </w:p>
     <w:p>
       <w:pPr>
+        <w:keepNext/>
         <w:spacing w:before="280" w:after="120" w:line="300" w:lineRule="auto"/>
         <w:pBdr>
           <w:bottom w:val="single" w:sz="6" w:space="4" w:color="D1D0CB"/>

</xml_diff>